<commit_message>
Update release notes for v5.13.0
</commit_message>
<xml_diff>
--- a/Help/RELEASE_NOTES.docx
+++ b/Help/RELEASE_NOTES.docx
@@ -3,20 +3,25 @@
 <w:document xmlns:wpc="http://schemas.microsoft.com/office/word/2010/wordprocessingCanvas" xmlns:cx="http://schemas.microsoft.com/office/drawing/2014/chartex" xmlns:cx1="http://schemas.microsoft.com/office/drawing/2015/9/8/chartex" xmlns:cx2="http://schemas.microsoft.com/office/drawing/2015/10/21/chartex" xmlns:cx3="http://schemas.microsoft.com/office/drawing/2016/5/9/chartex" xmlns:cx4="http://schemas.microsoft.com/office/drawing/2016/5/10/chartex" xmlns:cx5="http://schemas.microsoft.com/office/drawing/2016/5/11/chartex" xmlns:cx6="http://schemas.microsoft.com/office/drawing/2016/5/12/chartex" xmlns:cx7="http://schemas.microsoft.com/office/drawing/2016/5/13/chartex" xmlns:cx8="http://schemas.microsoft.com/office/drawing/2016/5/14/chartex" xmlns:mc="http://schemas.openxmlformats.org/markup-compatibility/2006" xmlns:aink="http://schemas.microsoft.com/office/drawing/2016/ink" xmlns:am3d="http://schemas.microsoft.com/office/drawing/2017/model3d" xmlns:o="urn:schemas-microsoft-com:office:office" xmlns:r="http://schemas.openxmlformats.org/officeDocument/2006/relationships" xmlns:m="http://schemas.openxmlformats.org/officeDocument/2006/math" xmlns:v="urn:schemas-microsoft-com:vml" xmlns:wp14="http://schemas.microsoft.com/office/word/2010/wordprocessingDrawing" xmlns:wp="http://schemas.openxmlformats.org/drawingml/2006/wordprocessingDrawing" xmlns:w10="urn:schemas-microsoft-com:office:word" xmlns:w="http://schemas.openxmlformats.org/wordprocessingml/2006/main" xmlns:w14="http://schemas.microsoft.com/office/word/2010/wordml" xmlns:w15="http://schemas.microsoft.com/office/word/2012/wordml" xmlns:w16cex="http://schemas.microsoft.com/office/word/2018/wordml/cex" xmlns:w16cid="http://schemas.microsoft.com/office/word/2016/wordml/cid" xmlns:w16="http://schemas.microsoft.com/office/word/2018/wordml" xmlns:w16sdtdh="http://schemas.microsoft.com/office/word/2020/wordml/sdtdatahash" xmlns:w16se="http://schemas.microsoft.com/office/word/2015/wordml/symex" xmlns:wpg="http://schemas.microsoft.com/office/word/2010/wordprocessingGroup" xmlns:wpi="http://schemas.microsoft.com/office/word/2010/wordprocessingInk" xmlns:wne="http://schemas.microsoft.com/office/word/2006/wordml" xmlns:wps="http://schemas.microsoft.com/office/word/2010/wordprocessingShape" mc:Ignorable="w14 w15 w16se w16cid w16 w16cex w16sdtdh wp14">
   <w:body>
     <w:p>
+      <w:proofErr w:type="spellStart"/>
       <w:r>
         <w:t>B</w:t>
       </w:r>
       <w:r>
-        <w:t>ioSum 5.1</w:t>
-      </w:r>
-      <w:r>
-        <w:t>2</w:t>
+        <w:t>ioSum</w:t>
+      </w:r>
+      <w:proofErr w:type="spellEnd"/>
+      <w:r>
+        <w:t xml:space="preserve"> 5.1</w:t>
+      </w:r>
+      <w:r>
+        <w:t>3</w:t>
       </w:r>
       <w:r>
         <w:t>.</w:t>
       </w:r>
       <w:r>
-        <w:t>1</w:t>
+        <w:t>0</w:t>
       </w:r>
       <w:r>
         <w:t xml:space="preserve"> Release Notes</w:t>
@@ -25,7 +30,7 @@
         <w:br/>
       </w:r>
       <w:r>
-        <w:t>February</w:t>
+        <w:t>April</w:t>
       </w:r>
       <w:r>
         <w:t xml:space="preserve"> 202</w:t>
@@ -51,18 +56,30 @@
         <w:rPr>
           <w:b/>
         </w:rPr>
-        <w:t>12.</w:t>
-      </w:r>
-      <w:r>
-        <w:rPr>
-          <w:b/>
-        </w:rPr>
         <w:t>1</w:t>
       </w:r>
       <w:r>
         <w:rPr>
           <w:b/>
         </w:rPr>
+        <w:t>3</w:t>
+      </w:r>
+      <w:r>
+        <w:rPr>
+          <w:b/>
+        </w:rPr>
+        <w:t>.</w:t>
+      </w:r>
+      <w:r>
+        <w:rPr>
+          <w:b/>
+        </w:rPr>
+        <w:t>0</w:t>
+      </w:r>
+      <w:r>
+        <w:rPr>
+          <w:b/>
+        </w:rPr>
         <w:t>)</w:t>
       </w:r>
       <w:r>
@@ -83,7 +100,156 @@
           <w:b/>
           <w:bCs/>
         </w:rPr>
-        <w:t xml:space="preserve">Existing legacy projects must be at v5.12.0 to be upgraded to v5.12.1. For example, 5.11.2 projects must first be upgraded to 5.12.0 before attempting to load into 5.12.1. Because the project.mdb is migrated to SQLite when opened for the first time in  v5.12.1, </w:t>
+        <w:t>Existing legacy projects must be at v5.12.</w:t>
+      </w:r>
+      <w:r>
+        <w:rPr>
+          <w:b/>
+          <w:bCs/>
+        </w:rPr>
+        <w:t>1</w:t>
+      </w:r>
+      <w:r>
+        <w:rPr>
+          <w:b/>
+          <w:bCs/>
+        </w:rPr>
+        <w:t xml:space="preserve"> to be upgraded to v5.1</w:t>
+      </w:r>
+      <w:r>
+        <w:rPr>
+          <w:b/>
+          <w:bCs/>
+        </w:rPr>
+        <w:t>3</w:t>
+      </w:r>
+      <w:r>
+        <w:rPr>
+          <w:b/>
+          <w:bCs/>
+        </w:rPr>
+        <w:t>.</w:t>
+      </w:r>
+      <w:r>
+        <w:rPr>
+          <w:b/>
+          <w:bCs/>
+        </w:rPr>
+        <w:t>0</w:t>
+      </w:r>
+      <w:r>
+        <w:rPr>
+          <w:b/>
+          <w:bCs/>
+        </w:rPr>
+        <w:t>. For example, 5.1</w:t>
+      </w:r>
+      <w:r>
+        <w:rPr>
+          <w:b/>
+          <w:bCs/>
+        </w:rPr>
+        <w:t>2</w:t>
+      </w:r>
+      <w:r>
+        <w:rPr>
+          <w:b/>
+          <w:bCs/>
+        </w:rPr>
+        <w:t>.</w:t>
+      </w:r>
+      <w:r>
+        <w:rPr>
+          <w:b/>
+          <w:bCs/>
+        </w:rPr>
+        <w:t>0</w:t>
+      </w:r>
+      <w:r>
+        <w:rPr>
+          <w:b/>
+          <w:bCs/>
+        </w:rPr>
+        <w:t xml:space="preserve"> projects must first be upgraded to 5.12.</w:t>
+      </w:r>
+      <w:r>
+        <w:rPr>
+          <w:b/>
+          <w:bCs/>
+        </w:rPr>
+        <w:t>1</w:t>
+      </w:r>
+      <w:r>
+        <w:rPr>
+          <w:b/>
+          <w:bCs/>
+        </w:rPr>
+        <w:t xml:space="preserve"> before attempting to load into 5.1</w:t>
+      </w:r>
+      <w:r>
+        <w:rPr>
+          <w:b/>
+          <w:bCs/>
+        </w:rPr>
+        <w:t>3</w:t>
+      </w:r>
+      <w:r>
+        <w:rPr>
+          <w:b/>
+          <w:bCs/>
+        </w:rPr>
+        <w:t xml:space="preserve">.1. Because the </w:t>
+      </w:r>
+      <w:r>
+        <w:rPr>
+          <w:b/>
+          <w:bCs/>
+        </w:rPr>
+        <w:t>plot and tree tables are modified</w:t>
+      </w:r>
+      <w:r>
+        <w:rPr>
+          <w:b/>
+          <w:bCs/>
+        </w:rPr>
+        <w:t xml:space="preserve"> when opened for the first time </w:t>
+      </w:r>
+      <w:proofErr w:type="gramStart"/>
+      <w:r>
+        <w:rPr>
+          <w:b/>
+          <w:bCs/>
+        </w:rPr>
+        <w:t>in  v5.1</w:t>
+      </w:r>
+      <w:r>
+        <w:rPr>
+          <w:b/>
+          <w:bCs/>
+        </w:rPr>
+        <w:t>3</w:t>
+      </w:r>
+      <w:r>
+        <w:rPr>
+          <w:b/>
+          <w:bCs/>
+        </w:rPr>
+        <w:t>.</w:t>
+      </w:r>
+      <w:r>
+        <w:rPr>
+          <w:b/>
+          <w:bCs/>
+        </w:rPr>
+        <w:t>0</w:t>
+      </w:r>
+      <w:proofErr w:type="gramEnd"/>
+      <w:r>
+        <w:rPr>
+          <w:b/>
+          <w:bCs/>
+        </w:rPr>
+        <w:t xml:space="preserve">, </w:t>
       </w:r>
       <w:r>
         <w:rPr>
@@ -91,7 +257,31 @@
           <w:bCs/>
           <w:u w:val="single"/>
         </w:rPr>
-        <w:t>it must not be opened again in any version below 5.12.1</w:t>
+        <w:t>it must not be opened again in any version below 5.1</w:t>
+      </w:r>
+      <w:r>
+        <w:rPr>
+          <w:b/>
+          <w:bCs/>
+          <w:u w:val="single"/>
+        </w:rPr>
+        <w:t>3</w:t>
+      </w:r>
+      <w:r>
+        <w:rPr>
+          <w:b/>
+          <w:bCs/>
+          <w:u w:val="single"/>
+        </w:rPr>
+        <w:t>.</w:t>
+      </w:r>
+      <w:r>
+        <w:rPr>
+          <w:b/>
+          <w:bCs/>
+          <w:u w:val="single"/>
+        </w:rPr>
+        <w:t>0</w:t>
       </w:r>
       <w:r>
         <w:rPr>
@@ -116,19 +306,6 @@
           <w:bCs/>
         </w:rPr>
         <w:t>.</w:t>
-      </w:r>
-    </w:p>
-    <w:p>
-      <w:pPr>
-        <w:rPr>
-          <w:b/>
-        </w:rPr>
-      </w:pPr>
-      <w:r>
-        <w:rPr>
-          <w:b/>
-        </w:rPr>
-        <w:t>Note: This is the final version to require MS Access components.</w:t>
       </w:r>
     </w:p>
     <w:p>
@@ -148,10 +325,33 @@
           <w:b/>
           <w:bCs/>
         </w:rPr>
-        <w:t xml:space="preserve">project.db: </w:t>
-      </w:r>
-      <w:r>
-        <w:t xml:space="preserve">The project.mdb is the final BioSum table to be migrated to SQLite. Paths to SQLite data sources can now be defined in the project data source manager. The Project Properties screen has been reformatted for clarity and ease of use. When the project is created, a workspace name can be assigned. Renaming of projects occurs only by changing the folder name containing the project or copying or moving the workspace contents to a new folder and/or drive with a different name—opening a project after such a rename/move/copy operation in the operating system (Windows) will reset the project workspace path to align with the new location/name. </w:t>
+        <w:t>MS Access and ODBC</w:t>
+      </w:r>
+      <w:r>
+        <w:rPr>
+          <w:b/>
+          <w:bCs/>
+        </w:rPr>
+        <w:t xml:space="preserve">: </w:t>
+      </w:r>
+      <w:r>
+        <w:t xml:space="preserve">This is the first version of </w:t>
+      </w:r>
+      <w:proofErr w:type="spellStart"/>
+      <w:r>
+        <w:t>BioSum</w:t>
+      </w:r>
+      <w:proofErr w:type="spellEnd"/>
+      <w:r>
+        <w:t xml:space="preserve"> with no dependencies on MS Access and/or the ODBC driver. If you wish to use MS Access as an ad hoc query engine, you will need these components but the </w:t>
+      </w:r>
+      <w:proofErr w:type="spellStart"/>
+      <w:r>
+        <w:t>BioSum</w:t>
+      </w:r>
+      <w:proofErr w:type="spellEnd"/>
+      <w:r>
+        <w:t xml:space="preserve"> application no longer requires them.</w:t>
       </w:r>
       <w:r>
         <w:br/>
@@ -174,67 +374,109 @@
           <w:b/>
           <w:bCs/>
         </w:rPr>
+        <w:t xml:space="preserve">FVS: </w:t>
+      </w:r>
+      <w:r>
+        <w:rPr>
+          <w:b/>
+          <w:bCs/>
+        </w:rPr>
         <w:t>FIA Tree Volume and Biomass Calculator</w:t>
       </w:r>
       <w:r>
-        <w:t>: The new volume and biomass calculator makes its debut in this version. It is available when using the ‘Batch Calculate Grid’ button in the Tree Volume and Biomass Calculator Troubleshooter tool. Analysts are responsible for populating the required fields in the TreeSampleTvbc table in the TreeSample.db. Instructions for this task are available from the System Administrator and will be added as an appendix to the next version of the BioSum User Guide.</w:t>
-      </w:r>
-    </w:p>
-    <w:p>
-      <w:pPr>
-        <w:ind w:left="720"/>
-      </w:pPr>
-      <w:r>
-        <w:t xml:space="preserve">The new calculator generates an FVS_CutTreeTvbc table in the \fvs\data\FVSOUT_TREE_LIST.db when FVS Out runs. The FCS calculator will continue to run and Processor, OpCost, and Optimizer will continue to rely on values from FCS output. </w:t>
-      </w:r>
-    </w:p>
-    <w:p>
-      <w:pPr>
-        <w:pStyle w:val="ListParagraph"/>
-        <w:numPr>
-          <w:ilvl w:val="0"/>
-          <w:numId w:val="2"/>
-        </w:numPr>
-      </w:pPr>
-      <w:r>
-        <w:rPr>
-          <w:b/>
-          <w:bCs/>
-        </w:rPr>
-        <w:t xml:space="preserve">Volume and Biomass Calculator Troubleshooter tool: </w:t>
-      </w:r>
-      <w:r>
-        <w:t>The tool adds the capability to export the contents of the grid as a table in an SQLite database to a location selected by the analyst.</w:t>
+        <w:t xml:space="preserve">: The new </w:t>
+      </w:r>
+      <w:r>
+        <w:t xml:space="preserve">tree </w:t>
+      </w:r>
+      <w:r>
+        <w:t xml:space="preserve">volume and biomass calculator </w:t>
+      </w:r>
+      <w:r>
+        <w:t>has been integrated into</w:t>
+      </w:r>
+      <w:r>
+        <w:t xml:space="preserve"> FVS Out processing and generates the </w:t>
+      </w:r>
+      <w:bookmarkStart w:id="0" w:name="_Hlk225414179"/>
+      <w:proofErr w:type="spellStart"/>
+      <w:r>
+        <w:t>FVS_CutTreeTvbc</w:t>
+      </w:r>
+      <w:bookmarkEnd w:id="0"/>
+      <w:proofErr w:type="spellEnd"/>
+      <w:r>
+        <w:t xml:space="preserve"> table in the \</w:t>
+      </w:r>
+      <w:proofErr w:type="spellStart"/>
+      <w:r>
+        <w:t>fvs</w:t>
+      </w:r>
+      <w:proofErr w:type="spellEnd"/>
+      <w:r>
+        <w:t>\data\</w:t>
+      </w:r>
+      <w:proofErr w:type="spellStart"/>
+      <w:r>
+        <w:t>FVSOUT_TREE_LIST.db</w:t>
+      </w:r>
+      <w:proofErr w:type="spellEnd"/>
+      <w:r>
+        <w:t xml:space="preserve">. The FVS Post Processing Audit and Processor </w:t>
+      </w:r>
+      <w:r>
+        <w:t xml:space="preserve">now </w:t>
+      </w:r>
+      <w:r>
+        <w:t xml:space="preserve">use </w:t>
+      </w:r>
+      <w:proofErr w:type="spellStart"/>
+      <w:r>
+        <w:t>FVS_CutTreeTvbc</w:t>
+      </w:r>
+      <w:proofErr w:type="spellEnd"/>
+      <w:r>
+        <w:t xml:space="preserve"> for input. The Processor output tables have the same fields but the values </w:t>
+      </w:r>
+      <w:r>
+        <w:t>will differ</w:t>
+      </w:r>
+      <w:r>
+        <w:t xml:space="preserve"> from previous runs </w:t>
+      </w:r>
+      <w:r>
+        <w:t>(</w:t>
+      </w:r>
+      <w:r>
+        <w:t>based on FICS</w:t>
+      </w:r>
+      <w:r>
+        <w:t>)</w:t>
+      </w:r>
+      <w:r>
+        <w:t xml:space="preserve"> due to changes in the calculations.</w:t>
       </w:r>
       <w:r>
         <w:br/>
       </w:r>
-    </w:p>
-    <w:p>
-      <w:pPr>
-        <w:pStyle w:val="ListParagraph"/>
-        <w:numPr>
-          <w:ilvl w:val="0"/>
-          <w:numId w:val="2"/>
-        </w:numPr>
-      </w:pPr>
-      <w:r>
-        <w:t>The following functions were rarely used and are no longer in BioSum: Personal Project Links and Notes, Shared Project Links and Notes, Contacts</w:t>
-      </w:r>
-      <w:r>
-        <w:t>, and the ability to print formatted tables from some gridviews</w:t>
-      </w:r>
-      <w:r>
-        <w:t>.</w:t>
-      </w:r>
-    </w:p>
-    <w:p>
-      <w:pPr>
-        <w:ind w:left="360"/>
-        <w:rPr>
-          <w:b/>
-        </w:rPr>
-      </w:pPr>
+      <w:r>
+        <w:br/>
+        <w:t xml:space="preserve">Note that the </w:t>
+      </w:r>
+      <w:proofErr w:type="spellStart"/>
+      <w:r>
+        <w:t>FVS_InForestTree</w:t>
+      </w:r>
+      <w:proofErr w:type="spellEnd"/>
+      <w:r>
+        <w:t xml:space="preserve"> table</w:t>
+      </w:r>
+      <w:r>
+        <w:t xml:space="preserve"> process</w:t>
+      </w:r>
+      <w:r>
+        <w:t xml:space="preserve"> hasn’t been converted to use FIA TVBC yet and is not available from the FVS Out pick list. This will be restored shortly in a future version. Also, most Tree Troubleshooter calculations are still pointed at FICS.</w:t>
+      </w:r>
     </w:p>
     <w:sectPr>
       <w:pgSz w:w="12240" w:h="15840"/>

</xml_diff>

<commit_message>
Changes to release notes for v5.13.0 requested by @jsfried
</commit_message>
<xml_diff>
--- a/Help/RELEASE_NOTES.docx
+++ b/Help/RELEASE_NOTES.docx
@@ -399,6 +399,7 @@
         <w:t xml:space="preserve"> FVS Out processing and generates the </w:t>
       </w:r>
       <w:bookmarkStart w:id="0" w:name="_Hlk225414179"/>
+      <w:bookmarkStart w:id="1" w:name="_Hlk226625860"/>
       <w:proofErr w:type="spellStart"/>
       <w:r>
         <w:t>FVS_CutTreeTvbc</w:t>
@@ -406,7 +407,11 @@
       <w:bookmarkEnd w:id="0"/>
       <w:proofErr w:type="spellEnd"/>
       <w:r>
-        <w:t xml:space="preserve"> table in the \</w:t>
+        <w:t xml:space="preserve"> table</w:t>
+      </w:r>
+      <w:bookmarkEnd w:id="1"/>
+      <w:r>
+        <w:t xml:space="preserve"> in the \</w:t>
       </w:r>
       <w:proofErr w:type="spellStart"/>
       <w:r>
@@ -461,21 +466,47 @@
       </w:r>
       <w:r>
         <w:br/>
-        <w:t xml:space="preserve">Note that the </w:t>
+        <w:t xml:space="preserve">FVS Out needs to be re-run for all packages for projects created prior to v5.13.0 to populate the </w:t>
       </w:r>
       <w:proofErr w:type="spellStart"/>
       <w:r>
-        <w:t>FVS_InForestTree</w:t>
+        <w:t>FVS_CutTreeTvbc</w:t>
       </w:r>
       <w:proofErr w:type="spellEnd"/>
       <w:r>
         <w:t xml:space="preserve"> table</w:t>
       </w:r>
       <w:r>
-        <w:t xml:space="preserve"> process</w:t>
-      </w:r>
-      <w:r>
-        <w:t xml:space="preserve"> hasn’t been converted to use FIA TVBC yet and is not available from the FVS Out pick list. This will be restored shortly in a future version. Also, most Tree Troubleshooter calculations are still pointed at FICS.</w:t>
+        <w:t xml:space="preserve"> as </w:t>
+      </w:r>
+      <w:proofErr w:type="spellStart"/>
+      <w:r>
+        <w:t>BioSum</w:t>
+      </w:r>
+      <w:proofErr w:type="spellEnd"/>
+      <w:r>
+        <w:t xml:space="preserve"> no longer recognizes its predecessor, </w:t>
+      </w:r>
+      <w:proofErr w:type="spellStart"/>
+      <w:r>
+        <w:t>FVS_CutTree</w:t>
+      </w:r>
+      <w:proofErr w:type="spellEnd"/>
+      <w:r>
+        <w:t>.</w:t>
+      </w:r>
+      <w:r>
+        <w:br/>
+      </w:r>
+      <w:r>
+        <w:br/>
+        <w:t xml:space="preserve">Note </w:t>
+      </w:r>
+      <w:r>
+        <w:t xml:space="preserve">that </w:t>
+      </w:r>
+      <w:r>
+        <w:t>most Tree Troubleshooter calculations are still pointed at FICS.</w:t>
       </w:r>
     </w:p>
     <w:sectPr>

</xml_diff>